<commit_message>
delete 1 file and update 3 files
</commit_message>
<xml_diff>
--- a/Settings for site - teacher settings.docx
+++ b/Settings for site - teacher settings.docx
@@ -111,7 +111,39 @@
         <w:rPr>
           <w:rFonts w:asciiTheme="minorHAnsi" w:hAnsiTheme="minorHAnsi"/>
         </w:rPr>
-        <w:t>Copy the whole folder named “site” to a normal local folder</w:t>
+        <w:t>Copy</w:t>
+      </w:r>
+      <w:r>
+        <w:rPr>
+          <w:rFonts w:asciiTheme="minorHAnsi" w:hAnsiTheme="minorHAnsi"/>
+        </w:rPr>
+        <w:t xml:space="preserve"> </w:t>
+      </w:r>
+      <w:r>
+        <w:rPr>
+          <w:rFonts w:asciiTheme="minorHAnsi" w:hAnsiTheme="minorHAnsi"/>
+        </w:rPr>
+        <w:t xml:space="preserve">(don’t </w:t>
+      </w:r>
+      <w:r>
+        <w:rPr>
+          <w:rFonts w:asciiTheme="minorHAnsi" w:hAnsiTheme="minorHAnsi"/>
+          <w:i/>
+          <w:iCs/>
+        </w:rPr>
+        <w:t>move</w:t>
+      </w:r>
+      <w:r>
+        <w:rPr>
+          <w:rFonts w:asciiTheme="minorHAnsi" w:hAnsiTheme="minorHAnsi"/>
+        </w:rPr>
+        <w:t xml:space="preserve">) </w:t>
+      </w:r>
+      <w:r>
+        <w:rPr>
+          <w:rFonts w:asciiTheme="minorHAnsi" w:hAnsiTheme="minorHAnsi"/>
+        </w:rPr>
+        <w:t>the whole folder named “site” to a normal local folder</w:t>
       </w:r>
       <w:r>
         <w:rPr>
@@ -163,16 +195,13 @@
     </w:p>
     <w:p>
       <w:r>
+        <w:t xml:space="preserve">This is optional.  </w:t>
+      </w:r>
+      <w:r>
         <w:t xml:space="preserve">If you </w:t>
       </w:r>
       <w:r>
-        <w:t xml:space="preserve">open the site’s main page – index.html </w:t>
-      </w:r>
-      <w:r>
-        <w:t>–</w:t>
-      </w:r>
-      <w:r>
-        <w:t xml:space="preserve"> simply by double-clicking it</w:t>
+        <w:t>open the site’s main page – index.html – simply by double-clicking it</w:t>
       </w:r>
       <w:r>
         <w:t>, you’ll find that</w:t>
@@ -180,25 +209,50 @@
       <w:r>
         <w:t xml:space="preserve"> nearly everything will work OK.  </w:t>
       </w:r>
-    </w:p>
-    <w:p>
-      <w:r>
-        <w:t xml:space="preserve">For </w:t>
-      </w:r>
-      <w:r>
-        <w:t xml:space="preserve">full </w:t>
-      </w:r>
-      <w:r>
-        <w:t>staff use</w:t>
-      </w:r>
-      <w:r>
-        <w:t xml:space="preserve"> though</w:t>
-      </w:r>
-      <w:r>
-        <w:t>, especially if you need to write updates to the Triage workbook,</w:t>
-      </w:r>
-      <w:r>
-        <w:t xml:space="preserve"> you need to open it through a server, rather than from Windows Explorer.  You can do that by installing VS Code and an extension called Live Server.</w:t>
+      <w:r>
+        <w:t>However, for full staff capabilities</w:t>
+      </w:r>
+      <w:r>
+        <w:t xml:space="preserve"> </w:t>
+      </w:r>
+      <w:r>
+        <w:t>(</w:t>
+      </w:r>
+      <w:r>
+        <w:t xml:space="preserve">which in June 2026 </w:t>
+      </w:r>
+      <w:r>
+        <w:t>probably only means the</w:t>
+      </w:r>
+      <w:r>
+        <w:t xml:space="preserve"> additional</w:t>
+      </w:r>
+      <w:r>
+        <w:t xml:space="preserve"> ability to write to the</w:t>
+      </w:r>
+      <w:r>
+        <w:t xml:space="preserve"> Triage </w:t>
+      </w:r>
+      <w:r>
+        <w:t>workbook and</w:t>
+      </w:r>
+      <w:r>
+        <w:t xml:space="preserve"> installing site as a PWA) </w:t>
+      </w:r>
+      <w:r>
+        <w:t xml:space="preserve">you need to open </w:t>
+      </w:r>
+      <w:r>
+        <w:t>index.html</w:t>
+      </w:r>
+      <w:r>
+        <w:t xml:space="preserve"> through a server</w:t>
+      </w:r>
+      <w:r>
+        <w:t xml:space="preserve"> that’s on your computer</w:t>
+      </w:r>
+      <w:r>
+        <w:t>.  You can do that by installing VS Code and an extension called Live Server.</w:t>
       </w:r>
     </w:p>
     <w:p>
@@ -248,8 +302,16 @@
       <w:r>
         <w:t xml:space="preserve"> </w:t>
       </w:r>
-      <w:r>
-        <w:t>https://code.visualstudio.com/</w:t>
+      <w:hyperlink r:id="rId9" w:history="1">
+        <w:r>
+          <w:rPr>
+            <w:rStyle w:val="Hyperlink"/>
+          </w:rPr>
+          <w:t>https://code.visualstudio.com/</w:t>
+        </w:r>
+      </w:hyperlink>
+      <w:r>
+        <w:t xml:space="preserve"> </w:t>
       </w:r>
     </w:p>
     <w:p>
@@ -327,16 +389,18 @@
         <w:ind w:left="720"/>
       </w:pPr>
       <w:r>
-        <w:t>Search for</w:t>
-      </w:r>
-      <w:r>
-        <w:t xml:space="preserve"> and install</w:t>
-      </w:r>
-      <w:r>
-        <w:rPr>
-          <w:i/>
-          <w:iCs/>
-        </w:rPr>
+        <w:t xml:space="preserve">You’ll find the extensions panel in the left sidebar.  </w:t>
+      </w:r>
+      <w:r>
+        <w:t xml:space="preserve">Search </w:t>
+      </w:r>
+      <w:r>
+        <w:t xml:space="preserve">there </w:t>
+      </w:r>
+      <w:r>
+        <w:t>for</w:t>
+      </w:r>
+      <w:r>
         <w:t xml:space="preserve"> </w:t>
       </w:r>
       <w:r>
@@ -349,12 +413,21 @@
       <w:r>
         <w:t xml:space="preserve"> by Ritwik Dey</w:t>
       </w:r>
+      <w:r>
+        <w:t xml:space="preserve"> </w:t>
+      </w:r>
+      <w:r>
+        <w:t>and install</w:t>
+      </w:r>
     </w:p>
     <w:p>
       <w:pPr>
         <w:ind w:left="720"/>
       </w:pPr>
       <w:r>
+        <w:rPr>
+          <w:noProof/>
+        </w:rPr>
         <w:drawing>
           <wp:inline distT="0" distB="0" distL="0" distR="0" wp14:anchorId="669F67C0" wp14:editId="147711E2">
             <wp:extent cx="2526086" cy="883542"/>
@@ -371,7 +444,7 @@
                     <pic:cNvPicPr/>
                   </pic:nvPicPr>
                   <pic:blipFill>
-                    <a:blip r:embed="rId9"/>
+                    <a:blip r:embed="rId10"/>
                     <a:stretch>
                       <a:fillRect/>
                     </a:stretch>
@@ -519,6 +592,7 @@
           <w:b/>
           <w:bCs/>
         </w:rPr>
+        <w:lastRenderedPageBreak/>
         <w:t>Start The Site</w:t>
       </w:r>
     </w:p>
@@ -546,6 +620,9 @@
         <w:ind w:left="720"/>
       </w:pPr>
       <w:r>
+        <w:rPr>
+          <w:noProof/>
+        </w:rPr>
         <w:drawing>
           <wp:inline distT="0" distB="0" distL="0" distR="0" wp14:anchorId="584694CF" wp14:editId="7EEA02DD">
             <wp:extent cx="753626" cy="224051"/>
@@ -562,7 +639,7 @@
                     <pic:cNvPicPr/>
                   </pic:nvPicPr>
                   <pic:blipFill>
-                    <a:blip r:embed="rId10"/>
+                    <a:blip r:embed="rId11"/>
                     <a:stretch>
                       <a:fillRect/>
                     </a:stretch>
@@ -599,7 +676,6 @@
         <w:ind w:left="720"/>
       </w:pPr>
       <w:r>
-        <w:lastRenderedPageBreak/>
         <w:t>The site should open in your browser at an address like:</w:t>
       </w:r>
     </w:p>
@@ -617,51 +693,40 @@
           <w:sz w:val="18"/>
           <w:szCs w:val="18"/>
         </w:rPr>
-        <w:t>http://127.0.0.1:5500</w:t>
-      </w:r>
+        <w:t>http://127.0.0.1:5500/</w:t>
+      </w:r>
+    </w:p>
+    <w:p>
+      <w:pPr>
+        <w:keepNext/>
+        <w:spacing w:after="0"/>
+        <w:ind w:left="720"/>
+      </w:pPr>
+      <w:r>
+        <w:t>or:</w:t>
+      </w:r>
+    </w:p>
+    <w:p>
+      <w:pPr>
+        <w:pStyle w:val="0code"/>
+        <w:ind w:left="993"/>
+      </w:pPr>
       <w:r>
         <w:rPr>
           <w:sz w:val="18"/>
           <w:szCs w:val="18"/>
         </w:rPr>
-        <w:t>/</w:t>
-      </w:r>
-    </w:p>
-    <w:p>
-      <w:pPr>
-        <w:keepNext/>
-        <w:spacing w:after="0"/>
+        <w:t>http://localhost:5500/</w:t>
+      </w:r>
+    </w:p>
+    <w:p>
+      <w:pPr>
         <w:ind w:left="720"/>
       </w:pPr>
       <w:r>
-        <w:t>or:</w:t>
-      </w:r>
-    </w:p>
-    <w:p>
-      <w:pPr>
-        <w:pStyle w:val="0code"/>
-        <w:ind w:left="993"/>
-      </w:pPr>
-      <w:r>
         <w:rPr>
-          <w:sz w:val="18"/>
-          <w:szCs w:val="18"/>
+          <w:noProof/>
         </w:rPr>
-        <w:t>http://localhost:5500</w:t>
-      </w:r>
-      <w:r>
-        <w:rPr>
-          <w:sz w:val="18"/>
-          <w:szCs w:val="18"/>
-        </w:rPr>
-        <w:t>/</w:t>
-      </w:r>
-    </w:p>
-    <w:p>
-      <w:pPr>
-        <w:ind w:left="720"/>
-      </w:pPr>
-      <w:r>
         <w:drawing>
           <wp:inline distT="0" distB="0" distL="0" distR="0" wp14:anchorId="0E8B022E" wp14:editId="03EA5857">
             <wp:extent cx="4822134" cy="1605419"/>
@@ -678,7 +743,7 @@
                     <pic:cNvPicPr/>
                   </pic:nvPicPr>
                   <pic:blipFill>
-                    <a:blip r:embed="rId11"/>
+                    <a:blip r:embed="rId12"/>
                     <a:stretch>
                       <a:fillRect/>
                     </a:stretch>
@@ -1690,13 +1755,7 @@
               <w:spacing w:before="40" w:after="40"/>
             </w:pPr>
             <w:r>
-              <w:t xml:space="preserve">Check the site was opened with Live Server </w:t>
-            </w:r>
-            <w:r>
-              <w:t xml:space="preserve">(via VS Code) </w:t>
-            </w:r>
-            <w:r>
-              <w:t>and that OneDrive is syncing the BIT Operations SharePoint files locally.</w:t>
+              <w:t>Check the site was opened with Live Server (via VS Code) and that OneDrive is syncing the BIT Operations SharePoint files locally.</w:t>
             </w:r>
           </w:p>
         </w:tc>
@@ -5816,6 +5875,7 @@
   <w:style w:type="character" w:default="1" w:styleId="DefaultParagraphFont">
     <w:name w:val="Default Paragraph Font"/>
     <w:uiPriority w:val="1"/>
+    <w:semiHidden/>
     <w:unhideWhenUsed/>
   </w:style>
   <w:style w:type="table" w:default="1" w:styleId="TableNormal">

</xml_diff>

<commit_message>
update 'Settings for site - teacher settings.docx', index.html, script.js and styles.css
</commit_message>
<xml_diff>
--- a/Settings for site - teacher settings.docx
+++ b/Settings for site - teacher settings.docx
@@ -612,22 +612,114 @@
         <w:ind w:left="720"/>
       </w:pPr>
       <w:r>
-        <w:t>Click the “Live server” icon in the bottom status bar</w:t>
-      </w:r>
-    </w:p>
-    <w:p>
-      <w:pPr>
+        <w:t>Click the “</w:t>
+      </w:r>
+      <w:r>
+        <w:t>Go Live</w:t>
+      </w:r>
+      <w:r>
+        <w:t>” icon in the bottom status bar</w:t>
+      </w:r>
+    </w:p>
+    <w:p>
+      <w:pPr>
+        <w:keepNext/>
         <w:ind w:left="720"/>
       </w:pPr>
       <w:r>
         <w:rPr>
           <w:noProof/>
+          <w14:ligatures w14:val="standardContextual"/>
         </w:rPr>
+        <mc:AlternateContent>
+          <mc:Choice Requires="wps">
+            <w:drawing>
+              <wp:anchor distT="0" distB="0" distL="114300" distR="114300" simplePos="0" relativeHeight="251659264" behindDoc="0" locked="0" layoutInCell="1" allowOverlap="1" wp14:anchorId="2B975760" wp14:editId="135B601E">
+                <wp:simplePos x="0" y="0"/>
+                <wp:positionH relativeFrom="column">
+                  <wp:posOffset>1167824</wp:posOffset>
+                </wp:positionH>
+                <wp:positionV relativeFrom="paragraph">
+                  <wp:posOffset>360382</wp:posOffset>
+                </wp:positionV>
+                <wp:extent cx="893258" cy="301167"/>
+                <wp:effectExtent l="95250" t="95250" r="116840" b="118110"/>
+                <wp:wrapNone/>
+                <wp:docPr id="541942427" name="Rectangle: Rounded Corners 1"/>
+                <wp:cNvGraphicFramePr/>
+                <a:graphic xmlns:a="http://schemas.openxmlformats.org/drawingml/2006/main">
+                  <a:graphicData uri="http://schemas.microsoft.com/office/word/2010/wordprocessingShape">
+                    <wps:wsp>
+                      <wps:cNvSpPr/>
+                      <wps:spPr>
+                        <a:xfrm>
+                          <a:off x="0" y="0"/>
+                          <a:ext cx="893258" cy="301167"/>
+                        </a:xfrm>
+                        <a:prstGeom prst="roundRect">
+                          <a:avLst/>
+                        </a:prstGeom>
+                        <a:noFill/>
+                        <a:ln w="57150">
+                          <a:solidFill>
+                            <a:srgbClr val="FFFF00"/>
+                          </a:solidFill>
+                        </a:ln>
+                        <a:effectLst>
+                          <a:outerShdw blurRad="63500" sx="102000" sy="102000" algn="ctr" rotWithShape="0">
+                            <a:prstClr val="black">
+                              <a:alpha val="40000"/>
+                            </a:prstClr>
+                          </a:outerShdw>
+                        </a:effectLst>
+                      </wps:spPr>
+                      <wps:style>
+                        <a:lnRef idx="2">
+                          <a:schemeClr val="accent1">
+                            <a:shade val="15000"/>
+                          </a:schemeClr>
+                        </a:lnRef>
+                        <a:fillRef idx="1">
+                          <a:schemeClr val="accent1"/>
+                        </a:fillRef>
+                        <a:effectRef idx="0">
+                          <a:schemeClr val="accent1"/>
+                        </a:effectRef>
+                        <a:fontRef idx="minor">
+                          <a:schemeClr val="lt1"/>
+                        </a:fontRef>
+                      </wps:style>
+                      <wps:bodyPr rot="0" spcFirstLastPara="0" vertOverflow="overflow" horzOverflow="overflow" vert="horz" wrap="square" lIns="91440" tIns="45720" rIns="91440" bIns="45720" numCol="1" spcCol="0" rtlCol="0" fromWordArt="0" anchor="ctr" anchorCtr="0" forceAA="0" compatLnSpc="1">
+                        <a:prstTxWarp prst="textNoShape">
+                          <a:avLst/>
+                        </a:prstTxWarp>
+                        <a:noAutofit/>
+                      </wps:bodyPr>
+                    </wps:wsp>
+                  </a:graphicData>
+                </a:graphic>
+                <wp14:sizeRelV relativeFrom="margin">
+                  <wp14:pctHeight>0</wp14:pctHeight>
+                </wp14:sizeRelV>
+              </wp:anchor>
+            </w:drawing>
+          </mc:Choice>
+          <mc:Fallback>
+            <w:pict>
+              <v:roundrect w14:anchorId="79C9DD61" id="Rectangle: Rounded Corners 1" o:spid="_x0000_s1026" style="position:absolute;margin-left:91.95pt;margin-top:28.4pt;width:70.35pt;height:23.7pt;z-index:251659264;visibility:visible;mso-wrap-style:square;mso-height-percent:0;mso-wrap-distance-left:9pt;mso-wrap-distance-top:0;mso-wrap-distance-right:9pt;mso-wrap-distance-bottom:0;mso-position-horizontal:absolute;mso-position-horizontal-relative:text;mso-position-vertical:absolute;mso-position-vertical-relative:text;mso-height-percent:0;mso-height-relative:margin;v-text-anchor:middle" arcsize="10923f" o:gfxdata="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" filled="f" strokecolor="yellow" strokeweight="4.5pt">
+                <v:stroke joinstyle="miter"/>
+                <v:shadow on="t" type="perspective" color="black" opacity="26214f" offset="0,0" matrix="66847f,,,66847f"/>
+              </v:roundrect>
+            </w:pict>
+          </mc:Fallback>
+        </mc:AlternateContent>
+      </w:r>
+      <w:r>
         <w:drawing>
-          <wp:inline distT="0" distB="0" distL="0" distR="0" wp14:anchorId="584694CF" wp14:editId="7EEA02DD">
-            <wp:extent cx="753626" cy="224051"/>
-            <wp:effectExtent l="0" t="0" r="0" b="5080"/>
-            <wp:docPr id="1440869678" name="Picture 1"/>
+          <wp:inline distT="0" distB="0" distL="0" distR="0" wp14:anchorId="2A21EFB5" wp14:editId="4303CFBF">
+            <wp:extent cx="1800000" cy="1026404"/>
+            <wp:effectExtent l="0" t="0" r="0" b="2540"/>
+            <wp:docPr id="1836639421" name="Picture 1"/>
             <wp:cNvGraphicFramePr>
               <a:graphicFrameLocks xmlns:a="http://schemas.openxmlformats.org/drawingml/2006/main" noChangeAspect="1"/>
             </wp:cNvGraphicFramePr>
@@ -635,7 +727,7 @@
               <a:graphicData uri="http://schemas.openxmlformats.org/drawingml/2006/picture">
                 <pic:pic xmlns:pic="http://schemas.openxmlformats.org/drawingml/2006/picture">
                   <pic:nvPicPr>
-                    <pic:cNvPr id="1440869678" name=""/>
+                    <pic:cNvPr id="1836639421" name=""/>
                     <pic:cNvPicPr/>
                   </pic:nvPicPr>
                   <pic:blipFill>
@@ -647,7 +739,59 @@
                   <pic:spPr>
                     <a:xfrm>
                       <a:off x="0" y="0"/>
-                      <a:ext cx="765683" cy="227635"/>
+                      <a:ext cx="1800000" cy="1026404"/>
+                    </a:xfrm>
+                    <a:prstGeom prst="rect">
+                      <a:avLst/>
+                    </a:prstGeom>
+                  </pic:spPr>
+                </pic:pic>
+              </a:graphicData>
+            </a:graphic>
+          </wp:inline>
+        </w:drawing>
+      </w:r>
+    </w:p>
+    <w:p>
+      <w:pPr>
+        <w:keepNext/>
+        <w:spacing w:after="0"/>
+        <w:ind w:left="720"/>
+      </w:pPr>
+      <w:r>
+        <w:t>You will be ready to go if “Go Live” changes to a Port: 5501 (or another number):</w:t>
+      </w:r>
+    </w:p>
+    <w:p>
+      <w:pPr>
+        <w:ind w:left="720"/>
+      </w:pPr>
+      <w:r>
+        <w:drawing>
+          <wp:inline distT="0" distB="0" distL="0" distR="0" wp14:anchorId="602289DF" wp14:editId="4DE6B1C4">
+            <wp:extent cx="1800000" cy="485496"/>
+            <wp:effectExtent l="0" t="0" r="0" b="0"/>
+            <wp:docPr id="734627915" name="Picture 1"/>
+            <wp:cNvGraphicFramePr>
+              <a:graphicFrameLocks xmlns:a="http://schemas.openxmlformats.org/drawingml/2006/main" noChangeAspect="1"/>
+            </wp:cNvGraphicFramePr>
+            <a:graphic xmlns:a="http://schemas.openxmlformats.org/drawingml/2006/main">
+              <a:graphicData uri="http://schemas.openxmlformats.org/drawingml/2006/picture">
+                <pic:pic xmlns:pic="http://schemas.openxmlformats.org/drawingml/2006/picture">
+                  <pic:nvPicPr>
+                    <pic:cNvPr id="734627915" name=""/>
+                    <pic:cNvPicPr/>
+                  </pic:nvPicPr>
+                  <pic:blipFill>
+                    <a:blip r:embed="rId12"/>
+                    <a:stretch>
+                      <a:fillRect/>
+                    </a:stretch>
+                  </pic:blipFill>
+                  <pic:spPr>
+                    <a:xfrm>
+                      <a:off x="0" y="0"/>
+                      <a:ext cx="1800000" cy="485496"/>
                     </a:xfrm>
                     <a:prstGeom prst="rect">
                       <a:avLst/>
@@ -743,7 +887,7 @@
                     <pic:cNvPicPr/>
                   </pic:nvPicPr>
                   <pic:blipFill>
-                    <a:blip r:embed="rId12"/>
+                    <a:blip r:embed="rId13"/>
                     <a:stretch>
                       <a:fillRect/>
                     </a:stretch>
@@ -930,6 +1074,7 @@
         <w:pStyle w:val="Heading2"/>
       </w:pPr>
       <w:r>
+        <w:lastRenderedPageBreak/>
         <w:t>Folder Path</w:t>
       </w:r>
     </w:p>
@@ -1012,7 +1157,6 @@
         <w:pStyle w:val="Heading2"/>
       </w:pPr>
       <w:r>
-        <w:lastRenderedPageBreak/>
         <w:t>Communications Settings</w:t>
       </w:r>
     </w:p>
@@ -1330,6 +1474,7 @@
         <w:spacing w:after="60"/>
       </w:pPr>
       <w:r>
+        <w:lastRenderedPageBreak/>
         <w:t>Run the command above.</w:t>
       </w:r>
     </w:p>
@@ -1474,7 +1619,6 @@
         <w:spacing w:after="0"/>
       </w:pPr>
       <w:r>
-        <w:lastRenderedPageBreak/>
         <w:t>Source.xlsx</w:t>
       </w:r>
     </w:p>
@@ -1804,6 +1948,7 @@
         <w:pStyle w:val="Heading1"/>
       </w:pPr>
       <w:r>
+        <w:lastRenderedPageBreak/>
         <w:t xml:space="preserve">Writing to </w:t>
       </w:r>
       <w:r>
@@ -7998,15 +8143,6 @@
 </file>
 
 <file path=customXml/item1.xml><?xml version="1.0" encoding="utf-8"?>
-<?mso-contentType ?>
-<FormTemplates xmlns="http://schemas.microsoft.com/sharepoint/v3/contenttype/forms">
-  <Display>DocumentLibraryForm</Display>
-  <Edit>DocumentLibraryForm</Edit>
-  <New>DocumentLibraryForm</New>
-</FormTemplates>
-</file>
-
-<file path=customXml/item2.xml><?xml version="1.0" encoding="utf-8"?>
 <p:properties xmlns:p="http://schemas.microsoft.com/office/2006/metadata/properties" xmlns:xsi="http://www.w3.org/2001/XMLSchema-instance" xmlns:pc="http://schemas.microsoft.com/office/infopath/2007/PartnerControls">
   <documentManagement>
     <TaxCatchAll xmlns="b59e3637-39ed-4a0a-8372-7aef286a6886" xsi:nil="true"/>
@@ -8016,6 +8152,15 @@
     <location xmlns="2c712ec8-b220-476e-85c7-e95e0333af74" xsi:nil="true"/>
   </documentManagement>
 </p:properties>
+</file>
+
+<file path=customXml/item2.xml><?xml version="1.0" encoding="utf-8"?>
+<?mso-contentType ?>
+<FormTemplates xmlns="http://schemas.microsoft.com/sharepoint/v3/contenttype/forms">
+  <Display>DocumentLibraryForm</Display>
+  <Edit>DocumentLibraryForm</Edit>
+  <New>DocumentLibraryForm</New>
+</FormTemplates>
 </file>
 
 <file path=customXml/item3.xml><?xml version="1.0" encoding="utf-8"?>
@@ -8322,20 +8467,20 @@
 </file>
 
 <file path=customXml/itemProps1.xml><?xml version="1.0" encoding="utf-8"?>
-<ds:datastoreItem xmlns:ds="http://schemas.openxmlformats.org/officeDocument/2006/customXml" ds:itemID="{99723237-228F-4002-9FE2-C67BC4E94DD1}">
-  <ds:schemaRefs>
-    <ds:schemaRef ds:uri="http://schemas.microsoft.com/sharepoint/v3/contenttype/forms"/>
-  </ds:schemaRefs>
-</ds:datastoreItem>
-</file>
-
-<file path=customXml/itemProps2.xml><?xml version="1.0" encoding="utf-8"?>
 <ds:datastoreItem xmlns:ds="http://schemas.openxmlformats.org/officeDocument/2006/customXml" ds:itemID="{2FF263C4-B3C4-4EFF-AE48-1B8A874BCC82}">
   <ds:schemaRefs>
     <ds:schemaRef ds:uri="http://schemas.microsoft.com/office/2006/metadata/properties"/>
     <ds:schemaRef ds:uri="http://schemas.microsoft.com/office/infopath/2007/PartnerControls"/>
     <ds:schemaRef ds:uri="b59e3637-39ed-4a0a-8372-7aef286a6886"/>
     <ds:schemaRef ds:uri="2c712ec8-b220-476e-85c7-e95e0333af74"/>
+  </ds:schemaRefs>
+</ds:datastoreItem>
+</file>
+
+<file path=customXml/itemProps2.xml><?xml version="1.0" encoding="utf-8"?>
+<ds:datastoreItem xmlns:ds="http://schemas.openxmlformats.org/officeDocument/2006/customXml" ds:itemID="{99723237-228F-4002-9FE2-C67BC4E94DD1}">
+  <ds:schemaRefs>
+    <ds:schemaRef ds:uri="http://schemas.microsoft.com/sharepoint/v3/contenttype/forms"/>
   </ds:schemaRefs>
 </ds:datastoreItem>
 </file>

</xml_diff>